<commit_message>
Add Coinly and Dotkin to the résumé document
Co-Authored-By: Claude Fable 5.1 <noreply@anthropic.com>
</commit_message>
<xml_diff>
--- a/Mani_Karthik_Resume.docx
+++ b/Mani_Karthik_Resume.docx
@@ -1163,6 +1163,191 @@
           <w:szCs w:val="20"/>
         </w:rPr>
         <w:t xml:space="preserve">Built using React (frontend), Supabase (backend &amp; database), Vercel (hosting), and Cloudflare (domain management &amp; security).</w:t>
+      </w:r>
+    </w:p>
+    <w:p>
+      <w:pPr>
+        <w:spacing w:before="120" w:after="30"/>
+      </w:pPr>
+      <w:r>
+        <w:rPr>
+          <w:rFonts w:ascii="Arial" w:cs="Arial" w:eastAsia="Arial" w:hAnsi="Arial"/>
+          <w:b/>
+          <w:bCs/>
+          <w:color w:val="1B3A6B"/>
+          <w:sz w:val="22"/>
+          <w:szCs w:val="22"/>
+        </w:rPr>
+        <w:t xml:space="preserve">COINLY — Personal Finance App (Google Play Store)</w:t>
+      </w:r>
+      <w:r>
+        <w:rPr>
+          <w:rFonts w:ascii="Arial" w:cs="Arial" w:eastAsia="Arial" w:hAnsi="Arial"/>
+          <w:color w:val="555555"/>
+          <w:sz w:val="20"/>
+          <w:szCs w:val="20"/>
+        </w:rPr>
+        <w:t xml:space="preserve">  |  </w:t>
+      </w:r>
+      <w:r>
+        <w:rPr>
+          <w:rFonts w:ascii="Arial" w:cs="Arial" w:eastAsia="Arial" w:hAnsi="Arial"/>
+          <w:color w:val="2E75B6"/>
+          <w:sz w:val="19"/>
+          <w:szCs w:val="19"/>
+        </w:rPr>
+        <w:t xml:space="preserve">play.google.com/store/apps/details?id=com.budget.coinly</w:t>
+      </w:r>
+      <w:r>
+        <w:rPr>
+          <w:rFonts w:ascii="Arial" w:cs="Arial" w:eastAsia="Arial" w:hAnsi="Arial"/>
+          <w:i/>
+          <w:iCs/>
+          <w:color w:val="555555"/>
+          <w:sz w:val="20"/>
+          <w:szCs w:val="20"/>
+        </w:rPr>
+        <w:t xml:space="preserve">  |  2026</w:t>
+      </w:r>
+    </w:p>
+    <w:p>
+      <w:pPr>
+        <w:pStyle w:val="ListParagraph"/>
+        <w:numPr>
+          <w:ilvl w:val="0"/>
+          <w:numId w:val="2"/>
+        </w:numPr>
+        <w:spacing w:before="55" w:after="55"/>
+      </w:pPr>
+      <w:r>
+        <w:rPr>
+          <w:rFonts w:ascii="Arial" w:cs="Arial" w:eastAsia="Arial" w:hAnsi="Arial"/>
+          <w:color w:val="222222"/>
+          <w:sz w:val="20"/>
+          <w:szCs w:val="20"/>
+        </w:rPr>
+        <w:t xml:space="preserve">Built an Android app for tracking expenses, income and transfers across multiple accounts, with monthly category budgets and clear spending reports and analytics.</w:t>
+      </w:r>
+    </w:p>
+    <w:p>
+      <w:pPr>
+        <w:pStyle w:val="ListParagraph"/>
+        <w:numPr>
+          <w:ilvl w:val="0"/>
+          <w:numId w:val="2"/>
+        </w:numPr>
+        <w:spacing w:before="55" w:after="55"/>
+      </w:pPr>
+      <w:r>
+        <w:rPr>
+          <w:rFonts w:ascii="Arial" w:cs="Arial" w:eastAsia="Arial" w:hAnsi="Arial"/>
+          <w:color w:val="222222"/>
+          <w:sz w:val="20"/>
+          <w:szCs w:val="20"/>
+        </w:rPr>
+        <w:t xml:space="preserve">Designed privacy-first: all financial data stays on the device and the core features need no account.</w:t>
+      </w:r>
+    </w:p>
+    <w:p>
+      <w:pPr>
+        <w:spacing w:before="120" w:after="30"/>
+      </w:pPr>
+      <w:r>
+        <w:rPr>
+          <w:rFonts w:ascii="Arial" w:cs="Arial" w:eastAsia="Arial" w:hAnsi="Arial"/>
+          <w:b/>
+          <w:bCs/>
+          <w:color w:val="1B3A6B"/>
+          <w:sz w:val="22"/>
+          <w:szCs w:val="22"/>
+        </w:rPr>
+        <w:t xml:space="preserve">DOTKIN — Desktop Focus Tracker (macOS / Windows / Linux)</w:t>
+      </w:r>
+      <w:r>
+        <w:rPr>
+          <w:rFonts w:ascii="Arial" w:cs="Arial" w:eastAsia="Arial" w:hAnsi="Arial"/>
+          <w:color w:val="555555"/>
+          <w:sz w:val="20"/>
+          <w:szCs w:val="20"/>
+        </w:rPr>
+        <w:t xml:space="preserve">  |  </w:t>
+      </w:r>
+      <w:r>
+        <w:rPr>
+          <w:rFonts w:ascii="Arial" w:cs="Arial" w:eastAsia="Arial" w:hAnsi="Arial"/>
+          <w:color w:val="2E75B6"/>
+          <w:sz w:val="19"/>
+          <w:szCs w:val="19"/>
+        </w:rPr>
+        <w:t xml:space="preserve">karthik07m.github.io/dotkin</w:t>
+      </w:r>
+      <w:r>
+        <w:rPr>
+          <w:rFonts w:ascii="Arial" w:cs="Arial" w:eastAsia="Arial" w:hAnsi="Arial"/>
+          <w:i/>
+          <w:iCs/>
+          <w:color w:val="555555"/>
+          <w:sz w:val="20"/>
+          <w:szCs w:val="20"/>
+        </w:rPr>
+        <w:t xml:space="preserve">  |  2026</w:t>
+      </w:r>
+    </w:p>
+    <w:p>
+      <w:pPr>
+        <w:pStyle w:val="ListParagraph"/>
+        <w:numPr>
+          <w:ilvl w:val="0"/>
+          <w:numId w:val="2"/>
+        </w:numPr>
+        <w:spacing w:before="55" w:after="55"/>
+      </w:pPr>
+      <w:r>
+        <w:rPr>
+          <w:rFonts w:ascii="Arial" w:cs="Arial" w:eastAsia="Arial" w:hAnsi="Arial"/>
+          <w:color w:val="222222"/>
+          <w:sz w:val="20"/>
+          <w:szCs w:val="20"/>
+        </w:rPr>
+        <w:t xml:space="preserve">Built a free, MIT-licensed desktop app with timed 10 to 45 minute focus blocks, a morning planner, and a floating desktop companion that shows time left and today’s priorities.</w:t>
+      </w:r>
+    </w:p>
+    <w:p>
+      <w:pPr>
+        <w:pStyle w:val="ListParagraph"/>
+        <w:numPr>
+          <w:ilvl w:val="0"/>
+          <w:numId w:val="2"/>
+        </w:numPr>
+        <w:spacing w:before="55" w:after="55"/>
+      </w:pPr>
+      <w:r>
+        <w:rPr>
+          <w:rFonts w:ascii="Arial" w:cs="Arial" w:eastAsia="Arial" w:hAnsi="Arial"/>
+          <w:color w:val="222222"/>
+          <w:sz w:val="20"/>
+          <w:szCs w:val="20"/>
+        </w:rPr>
+        <w:t xml:space="preserve">Added optional Claude-powered coaching that reads the user’s own session log; all data lives in a single local file with no account, server or telemetry.</w:t>
+      </w:r>
+    </w:p>
+    <w:p>
+      <w:pPr>
+        <w:pStyle w:val="ListParagraph"/>
+        <w:numPr>
+          <w:ilvl w:val="0"/>
+          <w:numId w:val="2"/>
+        </w:numPr>
+        <w:spacing w:before="55" w:after="55"/>
+      </w:pPr>
+      <w:r>
+        <w:rPr>
+          <w:rFonts w:ascii="Arial" w:cs="Arial" w:eastAsia="Arial" w:hAnsi="Arial"/>
+          <w:color w:val="222222"/>
+          <w:sz w:val="20"/>
+          <w:szCs w:val="20"/>
+        </w:rPr>
+        <w:t xml:space="preserve">Shipped as a self-contained HTML app in an Electron shell, installable on all three platforms.</w:t>
       </w:r>
     </w:p>
     <w:p>

</xml_diff>

<commit_message>
Deploy a4cb6f1: lite résumé without email or city
</commit_message>
<xml_diff>
--- a/Mani_Karthik_Resume.docx
+++ b/Mani_Karthik_Resume.docx
@@ -56,6 +56,19 @@
         <w:spacing w:after="200" w:before="0" w:lineRule="auto"/>
         <w:rPr/>
       </w:pPr>
+      <w:hyperlink r:id="rId11">
+        <w:r>
+          <w:rPr>
+            <w:rFonts w:ascii="Arial" w:cs="Arial" w:eastAsia="Arial" w:hAnsi="Arial"/>
+            <w:color w:val="2e75b6"/>
+            <w:sz w:val="19"/>
+            <w:szCs w:val="19"/>
+            <w:u w:val="single"/>
+            <w:rtl w:val="0"/>
+          </w:rPr>
+          <w:t xml:space="preserve">linkedin.com/in/mani-karthik-bollimuntha-b30268b7</w:t>
+        </w:r>
+      </w:hyperlink>
       <w:r>
         <w:rPr>
           <w:rFonts w:ascii="Arial" w:cs="Arial" w:eastAsia="Arial" w:hAnsi="Arial"/>
@@ -64,7 +77,7 @@
           <w:szCs w:val="19"/>
           <w:rtl w:val="0"/>
         </w:rPr>
-        <w:t xml:space="preserve">Herndon, VA  •  manikarthik@live.com  •  </w:t>
+        <w:t xml:space="preserve">  •  </w:t>
       </w:r>
       <w:hyperlink r:id="rId7">
         <w:r>

</xml_diff>